<commit_message>
Adicionar tipo de conteúdo Lista com suporte a ordenada, não ordenada e com ícone de check. Melhorar visualização das listas com cores e ícones personalizados. Atualizar documento de exemplo e API de geração por IA para processar listas.
</commit_message>
<xml_diff>
--- a/public/roteiro/exemplo-curso.docx
+++ b/public/roteiro/exemplo-curso.docx
@@ -633,6 +633,178 @@
     </w:p>
     <w:p/>
     <w:p>
+      <w:pPr>
+        <w:pStyle w:val="Heading2"/>
+      </w:pPr>
+      <w:r>
+        <w:t xml:space="preserve">💡 INDICADORES ESPECIAIS - Exemplo de LISTA</w:t>
+      </w:r>
+    </w:p>
+    <w:p>
+      <w:r>
+        <w:t xml:space="preserve">Para criar listas ordenadas ou não ordenadas, use os marcadores abaixo:</w:t>
+      </w:r>
+    </w:p>
+    <w:p/>
+    <w:p>
+      <w:r>
+        <w:rPr>
+          <w:b/>
+          <w:bCs/>
+        </w:rPr>
+        <w:t xml:space="preserve">LISTA_INICIO</w:t>
+      </w:r>
+    </w:p>
+    <w:p>
+      <w:r>
+        <w:rPr>
+          <w:b/>
+          <w:bCs/>
+        </w:rPr>
+        <w:t xml:space="preserve">Tipo de Lista: </w:t>
+      </w:r>
+      <w:r>
+        <w:t xml:space="preserve">nao-ordenada</w:t>
+      </w:r>
+    </w:p>
+    <w:p>
+      <w:r>
+        <w:rPr>
+          <w:b/>
+          <w:bCs/>
+        </w:rPr>
+        <w:t xml:space="preserve">Item 1: </w:t>
+      </w:r>
+      <w:r>
+        <w:t xml:space="preserve">500g de farinha de trigo tipo 00</w:t>
+      </w:r>
+    </w:p>
+    <w:p>
+      <w:r>
+        <w:rPr>
+          <w:b/>
+          <w:bCs/>
+        </w:rPr>
+        <w:t xml:space="preserve">Item 2: </w:t>
+      </w:r>
+      <w:r>
+        <w:t xml:space="preserve">325ml de água filtrada em temperatura ambiente</w:t>
+      </w:r>
+    </w:p>
+    <w:p>
+      <w:r>
+        <w:rPr>
+          <w:b/>
+          <w:bCs/>
+        </w:rPr>
+        <w:t xml:space="preserve">Item 3: </w:t>
+      </w:r>
+      <w:r>
+        <w:t xml:space="preserve">10g de sal refinado</w:t>
+      </w:r>
+    </w:p>
+    <w:p>
+      <w:r>
+        <w:rPr>
+          <w:b/>
+          <w:bCs/>
+        </w:rPr>
+        <w:t xml:space="preserve">Item 4: </w:t>
+      </w:r>
+      <w:r>
+        <w:t xml:space="preserve">3g de fermento biológico seco instantâneo</w:t>
+      </w:r>
+    </w:p>
+    <w:p>
+      <w:r>
+        <w:rPr>
+          <w:b/>
+          <w:bCs/>
+        </w:rPr>
+        <w:t xml:space="preserve">LISTA_FIM</w:t>
+      </w:r>
+    </w:p>
+    <w:p/>
+    <w:p>
+      <w:r>
+        <w:t xml:space="preserve">📝 OBSERVAÇÃO: A IA irá transformar o conteúdo entre LISTA_INICIO e LISTA_FIM em uma lista interativa. Tipos disponíveis: "nao-ordenada" (com bullets) ou "ordenada" (numerada). Use "Item X:" para cada item da lista.</w:t>
+      </w:r>
+    </w:p>
+    <w:p/>
+    <w:p>
+      <w:r>
+        <w:t xml:space="preserve">Exemplo de Lista Ordenada:</w:t>
+      </w:r>
+    </w:p>
+    <w:p/>
+    <w:p>
+      <w:r>
+        <w:rPr>
+          <w:b/>
+          <w:bCs/>
+        </w:rPr>
+        <w:t xml:space="preserve">LISTA_INICIO</w:t>
+      </w:r>
+    </w:p>
+    <w:p>
+      <w:r>
+        <w:rPr>
+          <w:b/>
+          <w:bCs/>
+        </w:rPr>
+        <w:t xml:space="preserve">Tipo de Lista: </w:t>
+      </w:r>
+      <w:r>
+        <w:t xml:space="preserve">ordenada</w:t>
+      </w:r>
+    </w:p>
+    <w:p>
+      <w:r>
+        <w:rPr>
+          <w:b/>
+          <w:bCs/>
+        </w:rPr>
+        <w:t xml:space="preserve">Item 1: </w:t>
+      </w:r>
+      <w:r>
+        <w:t xml:space="preserve">Corte a carne em pedaços médios de aproximadamente 200g</w:t>
+      </w:r>
+    </w:p>
+    <w:p>
+      <w:r>
+        <w:rPr>
+          <w:b/>
+          <w:bCs/>
+        </w:rPr>
+        <w:t xml:space="preserve">Item 2: </w:t>
+      </w:r>
+      <w:r>
+        <w:t xml:space="preserve">Coloque em uma tigela com água filtrada, cobrindo completamente a carne</w:t>
+      </w:r>
+    </w:p>
+    <w:p>
+      <w:r>
+        <w:rPr>
+          <w:b/>
+          <w:bCs/>
+        </w:rPr>
+        <w:t xml:space="preserve">Item 3: </w:t>
+      </w:r>
+      <w:r>
+        <w:t xml:space="preserve">Leve à geladeira por no mínimo 12 horas, trocando a água a cada 4 horas</w:t>
+      </w:r>
+    </w:p>
+    <w:p>
+      <w:r>
+        <w:rPr>
+          <w:b/>
+          <w:bCs/>
+        </w:rPr>
+        <w:t xml:space="preserve">LISTA_FIM</w:t>
+      </w:r>
+    </w:p>
+    <w:p/>
+    <w:p>
       <w:r>
         <w:t xml:space="preserve">---</w:t>
       </w:r>
@@ -664,6 +836,16 @@
     <w:p>
       <w:r>
         <w:t xml:space="preserve">• Especifique o Tipo de Frente: "titulo", "imagem" ou "imagem-titulo"</w:t>
+      </w:r>
+    </w:p>
+    <w:p>
+      <w:r>
+        <w:t xml:space="preserve">• Use LISTA_INICIO e LISTA_FIM para criar listas ordenadas ou não ordenadas</w:t>
+      </w:r>
+    </w:p>
+    <w:p>
+      <w:r>
+        <w:t xml:space="preserve">• Especifique o Tipo de Lista: "ordenada" (numerada) ou "nao-ordenada" (bullets)</w:t>
       </w:r>
     </w:p>
     <w:p>

</xml_diff>

<commit_message>
Adicionar exemplo de lista com check no documento de exemplo e atualizar instruções
</commit_message>
<xml_diff>
--- a/public/roteiro/exemplo-curso.docx
+++ b/public/roteiro/exemplo-curso.docx
@@ -727,7 +727,7 @@
     <w:p/>
     <w:p>
       <w:r>
-        <w:t xml:space="preserve">📝 OBSERVAÇÃO: A IA irá transformar o conteúdo entre LISTA_INICIO e LISTA_FIM em uma lista interativa. Tipos disponíveis: "nao-ordenada" (com bullets) ou "ordenada" (numerada). Use "Item X:" para cada item da lista.</w:t>
+        <w:t xml:space="preserve">📝 OBSERVAÇÃO: A IA irá transformar o conteúdo entre LISTA_INICIO e LISTA_FIM em uma lista interativa. Tipos disponíveis: "nao-ordenada" (com bullets), "ordenada" (numerada) ou "check" (com ícone de check). Use "Item X:" para cada item da lista.</w:t>
       </w:r>
     </w:p>
     <w:p/>
@@ -806,6 +806,79 @@
     <w:p/>
     <w:p>
       <w:r>
+        <w:t xml:space="preserve">Exemplo de Lista com Ícone de Check:</w:t>
+      </w:r>
+    </w:p>
+    <w:p/>
+    <w:p>
+      <w:r>
+        <w:rPr>
+          <w:b/>
+          <w:bCs/>
+        </w:rPr>
+        <w:t xml:space="preserve">LISTA_INICIO</w:t>
+      </w:r>
+    </w:p>
+    <w:p>
+      <w:r>
+        <w:rPr>
+          <w:b/>
+          <w:bCs/>
+        </w:rPr>
+        <w:t xml:space="preserve">Tipo de Lista: </w:t>
+      </w:r>
+      <w:r>
+        <w:t xml:space="preserve">check</w:t>
+      </w:r>
+    </w:p>
+    <w:p>
+      <w:r>
+        <w:rPr>
+          <w:b/>
+          <w:bCs/>
+        </w:rPr>
+        <w:t xml:space="preserve">Item 1: </w:t>
+      </w:r>
+      <w:r>
+        <w:t xml:space="preserve">Farinha de trigo tipo 00 verificada e peneirada</w:t>
+      </w:r>
+    </w:p>
+    <w:p>
+      <w:r>
+        <w:rPr>
+          <w:b/>
+          <w:bCs/>
+        </w:rPr>
+        <w:t xml:space="preserve">Item 2: </w:t>
+      </w:r>
+      <w:r>
+        <w:t xml:space="preserve">Água em temperatura ambiente preparada</w:t>
+      </w:r>
+    </w:p>
+    <w:p>
+      <w:r>
+        <w:rPr>
+          <w:b/>
+          <w:bCs/>
+        </w:rPr>
+        <w:t xml:space="preserve">Item 3: </w:t>
+      </w:r>
+      <w:r>
+        <w:t xml:space="preserve">Sal e fermento medidos e separados</w:t>
+      </w:r>
+    </w:p>
+    <w:p>
+      <w:r>
+        <w:rPr>
+          <w:b/>
+          <w:bCs/>
+        </w:rPr>
+        <w:t xml:space="preserve">LISTA_FIM</w:t>
+      </w:r>
+    </w:p>
+    <w:p/>
+    <w:p>
+      <w:r>
         <w:t xml:space="preserve">---</w:t>
       </w:r>
     </w:p>
@@ -840,12 +913,12 @@
     </w:p>
     <w:p>
       <w:r>
-        <w:t xml:space="preserve">• Use LISTA_INICIO e LISTA_FIM para criar listas ordenadas ou não ordenadas</w:t>
-      </w:r>
-    </w:p>
-    <w:p>
-      <w:r>
-        <w:t xml:space="preserve">• Especifique o Tipo de Lista: "ordenada" (numerada) ou "nao-ordenada" (bullets)</w:t>
+        <w:t xml:space="preserve">• Use LISTA_INICIO e LISTA_FIM para criar listas ordenadas, não ordenadas ou com ícone de check</w:t>
+      </w:r>
+    </w:p>
+    <w:p>
+      <w:r>
+        <w:t xml:space="preserve">• Especifique o Tipo de Lista: "ordenada" (numerada), "nao-ordenada" (bullets) ou "check" (com ícone de check)</w:t>
       </w:r>
     </w:p>
     <w:p>

</xml_diff>

<commit_message>
feat: adiciona tela de resultados ao quiz com nota e feedback motivacional
- Remove opção de reiniciar pergunta individual
- Adiciona tela de resultados ao final do quiz com nota (acertos/total e porcentagem)
- Adiciona mensagens de feedback motivacional baseadas na performance
- Permite reiniciar apenas o quiz completo após finalizar
- Melhora UX do quiz com feedback visual e mensagens estimulantes
</commit_message>
<xml_diff>
--- a/public/roteiro/exemplo-curso.docx
+++ b/public/roteiro/exemplo-curso.docx
@@ -732,6 +732,358 @@
     </w:p>
     <w:p/>
     <w:p>
+      <w:pPr>
+        <w:pStyle w:val="Heading2"/>
+      </w:pPr>
+      <w:r>
+        <w:t xml:space="preserve">💡 INDICADORES ESPECIAIS - Exemplo de QUIZ</w:t>
+      </w:r>
+    </w:p>
+    <w:p>
+      <w:r>
+        <w:t xml:space="preserve">Para criar quizzes interativos com múltiplas perguntas de múltipla escolha, use os marcadores abaixo:</w:t>
+      </w:r>
+    </w:p>
+    <w:p/>
+    <w:p>
+      <w:r>
+        <w:rPr>
+          <w:b/>
+          <w:bCs/>
+        </w:rPr>
+        <w:t xml:space="preserve">QUIZ_INICIO</w:t>
+      </w:r>
+    </w:p>
+    <w:p>
+      <w:r>
+        <w:rPr>
+          <w:b/>
+          <w:bCs/>
+        </w:rPr>
+        <w:t xml:space="preserve">Pergunta 1: </w:t>
+      </w:r>
+      <w:r>
+        <w:t xml:space="preserve">Qual é a temperatura ideal para assar pizza artesanal?</w:t>
+      </w:r>
+    </w:p>
+    <w:p>
+      <w:r>
+        <w:rPr>
+          <w:b/>
+          <w:bCs/>
+        </w:rPr>
+        <w:t xml:space="preserve">Dica (opcional): </w:t>
+      </w:r>
+      <w:r>
+        <w:t xml:space="preserve">Pense na temperatura de fornos profissionais e domésticos.</w:t>
+      </w:r>
+    </w:p>
+    <w:p>
+      <w:r>
+        <w:rPr>
+          <w:b/>
+          <w:bCs/>
+        </w:rPr>
+        <w:t xml:space="preserve">Opção A: </w:t>
+      </w:r>
+      <w:r>
+        <w:t xml:space="preserve">200-220°C</w:t>
+      </w:r>
+    </w:p>
+    <w:p>
+      <w:r>
+        <w:rPr>
+          <w:b/>
+          <w:bCs/>
+        </w:rPr>
+        <w:t xml:space="preserve">Feedback Opção A: </w:t>
+      </w:r>
+      <w:r>
+        <w:t xml:space="preserve">Incorreto. 200-220°C é muito baixa para pizza artesanal. Essa temperatura resulta em pizza com borda mole e base não crocante.</w:t>
+      </w:r>
+    </w:p>
+    <w:p>
+      <w:r>
+        <w:rPr>
+          <w:b/>
+          <w:bCs/>
+        </w:rPr>
+        <w:t xml:space="preserve">Opção B: </w:t>
+      </w:r>
+      <w:r>
+        <w:t xml:space="preserve">280-300°C</w:t>
+      </w:r>
+    </w:p>
+    <w:p>
+      <w:r>
+        <w:rPr>
+          <w:b/>
+          <w:bCs/>
+        </w:rPr>
+        <w:t xml:space="preserve">Feedback Opção B: </w:t>
+      </w:r>
+      <w:r>
+        <w:t xml:space="preserve">Correto! A temperatura ideal para pizza artesanal é entre 280-300°C. Esta alta temperatura permite que a pizza asse rapidamente (8-12 minutos), resultando em borda dourada e base crocante sem queimar o queijo.</w:t>
+      </w:r>
+    </w:p>
+    <w:p>
+      <w:r>
+        <w:rPr>
+          <w:b/>
+          <w:bCs/>
+        </w:rPr>
+        <w:t xml:space="preserve">Opção C: </w:t>
+      </w:r>
+      <w:r>
+        <w:t xml:space="preserve">250-270°C</w:t>
+      </w:r>
+    </w:p>
+    <w:p>
+      <w:r>
+        <w:rPr>
+          <w:b/>
+          <w:bCs/>
+        </w:rPr>
+        <w:t xml:space="preserve">Feedback Opção C: </w:t>
+      </w:r>
+      <w:r>
+        <w:t xml:space="preserve">Parcialmente correto. 250-270°C funciona, mas requer mais tempo de assamento (12-15 minutos) e pode não atingir a textura ideal. É uma temperatura aceitável para fornos domésticos.</w:t>
+      </w:r>
+    </w:p>
+    <w:p>
+      <w:r>
+        <w:rPr>
+          <w:b/>
+          <w:bCs/>
+        </w:rPr>
+        <w:t xml:space="preserve">Opção D: </w:t>
+      </w:r>
+      <w:r>
+        <w:t xml:space="preserve">350-400°C</w:t>
+      </w:r>
+    </w:p>
+    <w:p>
+      <w:r>
+        <w:rPr>
+          <w:b/>
+          <w:bCs/>
+        </w:rPr>
+        <w:t xml:space="preserve">Feedback Opção D: </w:t>
+      </w:r>
+      <w:r>
+        <w:t xml:space="preserve">Incorreto. 350-400°C é muito alta e queimaria a pizza rapidamente. Mesmo fornos profissionais de pizza raramente passam de 300°C.</w:t>
+      </w:r>
+    </w:p>
+    <w:p>
+      <w:r>
+        <w:rPr>
+          <w:b/>
+          <w:bCs/>
+        </w:rPr>
+        <w:t xml:space="preserve">Opção E: </w:t>
+      </w:r>
+      <w:r>
+        <w:t xml:space="preserve">180-200°C</w:t>
+      </w:r>
+    </w:p>
+    <w:p>
+      <w:r>
+        <w:rPr>
+          <w:b/>
+          <w:bCs/>
+        </w:rPr>
+        <w:t xml:space="preserve">Feedback Opção E: </w:t>
+      </w:r>
+      <w:r>
+        <w:t xml:space="preserve">Incorreto. 180-200°C é temperatura de pão, não de pizza. Resultaria em pizza mole, sem crocância e com borda não dourada.</w:t>
+      </w:r>
+    </w:p>
+    <w:p>
+      <w:r>
+        <w:rPr>
+          <w:b/>
+          <w:bCs/>
+        </w:rPr>
+        <w:t xml:space="preserve">Resposta Correta: </w:t>
+      </w:r>
+      <w:r>
+        <w:t xml:space="preserve">B</w:t>
+      </w:r>
+    </w:p>
+    <w:p/>
+    <w:p>
+      <w:r>
+        <w:rPr>
+          <w:b/>
+          <w:bCs/>
+        </w:rPr>
+        <w:t xml:space="preserve">Pergunta 2: </w:t>
+      </w:r>
+      <w:r>
+        <w:t xml:space="preserve">Quanto tempo de fermentação é recomendado para uma massa de pizza artesanal com melhor sabor?</w:t>
+      </w:r>
+    </w:p>
+    <w:p>
+      <w:r>
+        <w:rPr>
+          <w:b/>
+          <w:bCs/>
+        </w:rPr>
+        <w:t xml:space="preserve">Dica (opcional): </w:t>
+      </w:r>
+      <w:r>
+        <w:t xml:space="preserve">Pense na diferença entre fermentação rápida e lenta.</w:t>
+      </w:r>
+    </w:p>
+    <w:p>
+      <w:r>
+        <w:rPr>
+          <w:b/>
+          <w:bCs/>
+        </w:rPr>
+        <w:t xml:space="preserve">Opção A: </w:t>
+      </w:r>
+      <w:r>
+        <w:t xml:space="preserve">1-2 horas em temperatura ambiente</w:t>
+      </w:r>
+    </w:p>
+    <w:p>
+      <w:r>
+        <w:rPr>
+          <w:b/>
+          <w:bCs/>
+        </w:rPr>
+        <w:t xml:space="preserve">Feedback Opção A: </w:t>
+      </w:r>
+      <w:r>
+        <w:t xml:space="preserve">Funcional, mas não ideal. 1-2 horas é fermentação rápida que funciona, mas não desenvolve completamente o sabor. A massa fica mais simples no paladar.</w:t>
+      </w:r>
+    </w:p>
+    <w:p>
+      <w:r>
+        <w:rPr>
+          <w:b/>
+          <w:bCs/>
+        </w:rPr>
+        <w:t xml:space="preserve">Opção B: </w:t>
+      </w:r>
+      <w:r>
+        <w:t xml:space="preserve">24-48 horas na geladeira</w:t>
+      </w:r>
+    </w:p>
+    <w:p>
+      <w:r>
+        <w:rPr>
+          <w:b/>
+          <w:bCs/>
+        </w:rPr>
+        <w:t xml:space="preserve">Feedback Opção B: </w:t>
+      </w:r>
+      <w:r>
+        <w:t xml:space="preserve">Correto! Fermentação lenta na geladeira por 24-48 horas desenvolve melhor o sabor, textura mais aerada e crocante. A baixa temperatura permite fermentação controlada que desenvolve compostos de sabor complexos.</w:t>
+      </w:r>
+    </w:p>
+    <w:p>
+      <w:r>
+        <w:rPr>
+          <w:b/>
+          <w:bCs/>
+        </w:rPr>
+        <w:t xml:space="preserve">Opção C: </w:t>
+      </w:r>
+      <w:r>
+        <w:t xml:space="preserve">6-8 horas em temperatura ambiente</w:t>
+      </w:r>
+    </w:p>
+    <w:p>
+      <w:r>
+        <w:rPr>
+          <w:b/>
+          <w:bCs/>
+        </w:rPr>
+        <w:t xml:space="preserve">Feedback Opção C: </w:t>
+      </w:r>
+      <w:r>
+        <w:t xml:space="preserve">Parcialmente correto. 6-8 horas funciona bem e já desenvolve bom sabor, mas fermentação muito longa em temperatura ambiente pode estragar ou fermentar demais.</w:t>
+      </w:r>
+    </w:p>
+    <w:p>
+      <w:r>
+        <w:rPr>
+          <w:b/>
+          <w:bCs/>
+        </w:rPr>
+        <w:t xml:space="preserve">Opção D: </w:t>
+      </w:r>
+      <w:r>
+        <w:t xml:space="preserve">30 minutos em temperatura ambiente</w:t>
+      </w:r>
+    </w:p>
+    <w:p>
+      <w:r>
+        <w:rPr>
+          <w:b/>
+          <w:bCs/>
+        </w:rPr>
+        <w:t xml:space="preserve">Feedback Opção D: </w:t>
+      </w:r>
+      <w:r>
+        <w:t xml:space="preserve">Incorreto. 30 minutos é tempo insuficiente para uma fermentação adequada. A massa ficará densa, sem sabor desenvolvido e com textura não ideal.</w:t>
+      </w:r>
+    </w:p>
+    <w:p>
+      <w:r>
+        <w:rPr>
+          <w:b/>
+          <w:bCs/>
+        </w:rPr>
+        <w:t xml:space="preserve">Opção E: </w:t>
+      </w:r>
+      <w:r>
+        <w:t xml:space="preserve">72 horas ou mais na geladeira</w:t>
+      </w:r>
+    </w:p>
+    <w:p>
+      <w:r>
+        <w:rPr>
+          <w:b/>
+          <w:bCs/>
+        </w:rPr>
+        <w:t xml:space="preserve">Feedback Opção E: </w:t>
+      </w:r>
+      <w:r>
+        <w:t xml:space="preserve">Muito longo. Após 48-72 horas, a massa pode começar a perder qualidade, desenvolver sabores ácidos excessivos ou até estragar. O ideal é 24-48 horas.</w:t>
+      </w:r>
+    </w:p>
+    <w:p>
+      <w:r>
+        <w:rPr>
+          <w:b/>
+          <w:bCs/>
+        </w:rPr>
+        <w:t xml:space="preserve">Resposta Correta: </w:t>
+      </w:r>
+      <w:r>
+        <w:t xml:space="preserve">B</w:t>
+      </w:r>
+    </w:p>
+    <w:p>
+      <w:r>
+        <w:rPr>
+          <w:b/>
+          <w:bCs/>
+        </w:rPr>
+        <w:t xml:space="preserve">QUIZ_FIM</w:t>
+      </w:r>
+    </w:p>
+    <w:p/>
+    <w:p>
+      <w:r>
+        <w:t xml:space="preserve">📝 OBSERVAÇÃO: A IA irá transformar o conteúdo entre QUIZ_INICIO e QUIZ_FIM em um quiz interativo. Você pode criar múltiplas perguntas no mesmo bloco. Cada pergunta deve ter exatamente 5 opções (A, B, C, D, E) e apenas 1 resposta correta. Todas as opções devem ter feedback explicativo.</w:t>
+      </w:r>
+    </w:p>
+    <w:p/>
+    <w:p>
       <w:r>
         <w:t xml:space="preserve">Exemplo de Lista Ordenada:</w:t>
       </w:r>
@@ -919,6 +1271,21 @@
     <w:p>
       <w:r>
         <w:t xml:space="preserve">• Especifique o Tipo de Lista: "ordenada" (numerada), "nao-ordenada" (bullets) ou "check" (com ícone de check)</w:t>
+      </w:r>
+    </w:p>
+    <w:p>
+      <w:r>
+        <w:t xml:space="preserve">• Use QUIZ_INICIO e QUIZ_FIM para criar quizzes interativos com múltiplas perguntas</w:t>
+      </w:r>
+    </w:p>
+    <w:p>
+      <w:r>
+        <w:t xml:space="preserve">• Dentro do quiz, use "Pergunta X:", "Dica (opcional):", "Opção A/B/C/D/E:", "Feedback Opção X:" e "Resposta Correta:" para cada pergunta</w:t>
+      </w:r>
+    </w:p>
+    <w:p>
+      <w:r>
+        <w:t xml:space="preserve">• Cada pergunta deve ter exatamente 5 opções e apenas 1 resposta correta</w:t>
       </w:r>
     </w:p>
     <w:p>

</xml_diff>

<commit_message>
docs: adiciona exemplos de Info Box na documentação e arquivos de exemplo
</commit_message>
<xml_diff>
--- a/public/roteiro/exemplo-curso.docx
+++ b/public/roteiro/exemplo-curso.docx
@@ -1084,6 +1084,197 @@
     </w:p>
     <w:p/>
     <w:p>
+      <w:pPr>
+        <w:pStyle w:val="Heading2"/>
+      </w:pPr>
+      <w:r>
+        <w:t xml:space="preserve">💡 INDICADORES ESPECIAIS - Exemplo de INFOBOX</w:t>
+      </w:r>
+    </w:p>
+    <w:p>
+      <w:r>
+        <w:t xml:space="preserve">Para criar caixas de informação destacadas com cores e ícones, use os marcadores abaixo:</w:t>
+      </w:r>
+    </w:p>
+    <w:p/>
+    <w:p>
+      <w:r>
+        <w:rPr>
+          <w:b/>
+          <w:bCs/>
+        </w:rPr>
+        <w:t xml:space="preserve">INFOBOX_INICIO</w:t>
+      </w:r>
+    </w:p>
+    <w:p>
+      <w:r>
+        <w:rPr>
+          <w:b/>
+          <w:bCs/>
+        </w:rPr>
+        <w:t xml:space="preserve">Tipo do Info Box: </w:t>
+      </w:r>
+      <w:r>
+        <w:t xml:space="preserve">atencao</w:t>
+      </w:r>
+    </w:p>
+    <w:p>
+      <w:r>
+        <w:rPr>
+          <w:b/>
+          <w:bCs/>
+        </w:rPr>
+        <w:t xml:space="preserve">Título (opcional): </w:t>
+      </w:r>
+      <w:r>
+        <w:t xml:space="preserve">Proteja-se</w:t>
+      </w:r>
+    </w:p>
+    <w:p>
+      <w:r>
+        <w:rPr>
+          <w:b/>
+          <w:bCs/>
+        </w:rPr>
+        <w:t xml:space="preserve">Texto do Corpo: </w:t>
+      </w:r>
+      <w:r>
+        <w:t xml:space="preserve">Sempre use luvas ao manusear ingredientes quentes e trabalhe com superfícies limpas. Mantenha a carne de sol refrigerada até o momento do uso e não deixe alimentos perecíveis em temperatura ambiente por mais de 2 horas. Higiene é fundamental na preparação de alimentos!</w:t>
+      </w:r>
+    </w:p>
+    <w:p>
+      <w:r>
+        <w:rPr>
+          <w:b/>
+          <w:bCs/>
+        </w:rPr>
+        <w:t xml:space="preserve">INFOBOX_FIM</w:t>
+      </w:r>
+    </w:p>
+    <w:p/>
+    <w:p>
+      <w:r>
+        <w:t xml:space="preserve">📝 OBSERVAÇÃO: A IA irá transformar o conteúdo entre INFOBOX_INICIO e INFOBOX_FIM em uma caixa de informação destacada. Tipos disponíveis: "atencao" (amarelo, alerta), "saiba_mais" (azul, lâmpada), "info" (cinza, informação), "curiosidade" (roxo, estrelas).</w:t>
+      </w:r>
+    </w:p>
+    <w:p/>
+    <w:p>
+      <w:r>
+        <w:t xml:space="preserve">Exemplos de outros tipos de Info Box:</w:t>
+      </w:r>
+    </w:p>
+    <w:p/>
+    <w:p>
+      <w:r>
+        <w:rPr>
+          <w:b/>
+          <w:bCs/>
+        </w:rPr>
+        <w:t xml:space="preserve">INFOBOX_INICIO</w:t>
+      </w:r>
+    </w:p>
+    <w:p>
+      <w:r>
+        <w:rPr>
+          <w:b/>
+          <w:bCs/>
+        </w:rPr>
+        <w:t xml:space="preserve">Tipo do Info Box: </w:t>
+      </w:r>
+      <w:r>
+        <w:t xml:space="preserve">saiba_mais</w:t>
+      </w:r>
+    </w:p>
+    <w:p>
+      <w:r>
+        <w:rPr>
+          <w:b/>
+          <w:bCs/>
+        </w:rPr>
+        <w:t xml:space="preserve">Título (opcional): </w:t>
+      </w:r>
+      <w:r>
+        <w:t xml:space="preserve">Dica Profissional</w:t>
+      </w:r>
+    </w:p>
+    <w:p>
+      <w:r>
+        <w:rPr>
+          <w:b/>
+          <w:bCs/>
+        </w:rPr>
+        <w:t xml:space="preserve">Texto do Corpo: </w:t>
+      </w:r>
+      <w:r>
+        <w:t xml:space="preserve">Para uma pizza ainda mais saborosa, experimente usar queijo coalho junto com a muçarela. O queijo coalho derrete menos que a muçarela e adiciona um sabor característico nordestino que combina perfeitamente com a carne de sol.</w:t>
+      </w:r>
+    </w:p>
+    <w:p>
+      <w:r>
+        <w:rPr>
+          <w:b/>
+          <w:bCs/>
+        </w:rPr>
+        <w:t xml:space="preserve">INFOBOX_FIM</w:t>
+      </w:r>
+    </w:p>
+    <w:p/>
+    <w:p>
+      <w:r>
+        <w:rPr>
+          <w:b/>
+          <w:bCs/>
+        </w:rPr>
+        <w:t xml:space="preserve">INFOBOX_INICIO</w:t>
+      </w:r>
+    </w:p>
+    <w:p>
+      <w:r>
+        <w:rPr>
+          <w:b/>
+          <w:bCs/>
+        </w:rPr>
+        <w:t xml:space="preserve">Tipo do Info Box: </w:t>
+      </w:r>
+      <w:r>
+        <w:t xml:space="preserve">curiosidade</w:t>
+      </w:r>
+    </w:p>
+    <w:p>
+      <w:r>
+        <w:rPr>
+          <w:b/>
+          <w:bCs/>
+        </w:rPr>
+        <w:t xml:space="preserve">Título (opcional): </w:t>
+      </w:r>
+      <w:r>
+        <w:t xml:space="preserve"/>
+      </w:r>
+    </w:p>
+    <w:p>
+      <w:r>
+        <w:rPr>
+          <w:b/>
+          <w:bCs/>
+        </w:rPr>
+        <w:t xml:space="preserve">Texto do Corpo: </w:t>
+      </w:r>
+      <w:r>
+        <w:t xml:space="preserve">A pizza de carne de sol é uma criação brasileira que combina técnicas italianas com ingredientes nordestinos. A carne de sol foi criada como forma de preservar a carne no sertão nordestino, onde o sal e o sol eram usados para desidratar e conservar a proteína. Hoje, é um ingrediente apreciado em todo o Brasil!</w:t>
+      </w:r>
+    </w:p>
+    <w:p>
+      <w:r>
+        <w:rPr>
+          <w:b/>
+          <w:bCs/>
+        </w:rPr>
+        <w:t xml:space="preserve">INFOBOX_FIM</w:t>
+      </w:r>
+    </w:p>
+    <w:p/>
+    <w:p>
       <w:r>
         <w:t xml:space="preserve">Exemplo de Lista Ordenada:</w:t>
       </w:r>
@@ -1286,6 +1477,16 @@
     <w:p>
       <w:r>
         <w:t xml:space="preserve">• Cada pergunta deve ter exatamente 5 opções e apenas 1 resposta correta</w:t>
+      </w:r>
+    </w:p>
+    <w:p>
+      <w:r>
+        <w:t xml:space="preserve">• Use INFOBOX_INICIO e INFOBOX_FIM para criar caixas de informação destacadas</w:t>
+      </w:r>
+    </w:p>
+    <w:p>
+      <w:r>
+        <w:t xml:space="preserve">• Dentro do Info Box, especifique "Tipo do Info Box:" (atencao, saiba_mais, info ou curiosidade), "Título (opcional):" e "Texto do Corpo:"</w:t>
       </w:r>
     </w:p>
     <w:p>

</xml_diff>